<commit_message>
Revert resume download to Word document
</commit_message>
<xml_diff>
--- a/Web Developemnt Resume.docx
+++ b/Web Developemnt Resume.docx
@@ -2,171 +2,6 @@
 <file path=word/document.xml><?xml version="1.0" encoding="utf-8"?>
 <w:document xmlns:wpc="http://schemas.microsoft.com/office/word/2010/wordprocessingCanvas" xmlns:cx="http://schemas.microsoft.com/office/drawing/2014/chartex" xmlns:mc="http://schemas.openxmlformats.org/markup-compatibility/2006" xmlns:o="urn:schemas-microsoft-com:office:office" xmlns:r="http://schemas.openxmlformats.org/officeDocument/2006/relationships" xmlns:m="http://schemas.openxmlformats.org/officeDocument/2006/math" xmlns:v="urn:schemas-microsoft-com:vml" xmlns:wp14="http://schemas.microsoft.com/office/word/2010/wordprocessingDrawing" xmlns:wp="http://schemas.openxmlformats.org/drawingml/2006/wordprocessingDrawing" xmlns:w10="urn:schemas-microsoft-com:office:word" xmlns:w="http://schemas.openxmlformats.org/wordprocessingml/2006/main" xmlns:w14="http://schemas.microsoft.com/office/word/2010/wordml" xmlns:w15="http://schemas.microsoft.com/office/word/2012/wordml" xmlns:w16se="http://schemas.microsoft.com/office/word/2015/wordml/symex" xmlns:wpg="http://schemas.microsoft.com/office/word/2010/wordprocessingGroup" xmlns:wpi="http://schemas.microsoft.com/office/word/2010/wordprocessingInk" xmlns:wne="http://schemas.microsoft.com/office/word/2006/wordml" xmlns:wps="http://schemas.microsoft.com/office/word/2010/wordprocessingShape" mc:Ignorable="w14 w15 w16se wp14">
   <w:body>
-    <w:p>
-      <w:pPr>
-        <w:spacing w:after="120"/>
-      </w:pPr>
-      <w:r>
-        <w:rPr>
-          <w:rFonts w:ascii="Calibri" w:eastAsia="Calibri" w:hAnsi="Calibri" w:cs="Calibri"/>
-          <w:b/>
-          <w:bCs/>
-          <w:color w:val="1F3864"/>
-          <w:sz w:val="64"/>
-          <w:szCs w:val="64"/>
-        </w:rPr>
-        <w:t>ACTS N.</w:t>
-      </w:r>
-      <w:r>
-        <w:rPr>
-          <w:rFonts w:ascii="Calibri" w:eastAsia="Calibri" w:hAnsi="Calibri" w:cs="Calibri"/>
-          <w:b/>
-          <w:bCs/>
-          <w:color w:val="1F3864"/>
-          <w:sz w:val="64"/>
-          <w:szCs w:val="64"/>
-        </w:rPr>
-        <w:t xml:space="preserve"> </w:t>
-      </w:r>
-      <w:r>
-        <w:rPr>
-          <w:rFonts w:ascii="Calibri" w:eastAsia="Calibri" w:hAnsi="Calibri" w:cs="Calibri"/>
-          <w:b/>
-          <w:bCs/>
-          <w:color w:val="1F3864"/>
-          <w:sz w:val="64"/>
-          <w:szCs w:val="64"/>
-        </w:rPr>
-        <w:t>NIMELY</w:t>
-      </w:r>
-    </w:p>
-    <w:p>
-      <w:pPr>
-        <w:spacing w:after="20"/>
-      </w:pPr>
-      <w:r>
-        <w:rPr>
-          <w:rFonts w:eastAsia="Calibri"/>
-          <w:b/>
-          <w:bCs/>
-          <w:sz w:val="22"/>
-          <w:szCs w:val="22"/>
-        </w:rPr>
-        <w:t xml:space="preserve">Address:  </w:t>
-      </w:r>
-      <w:r>
-        <w:rPr>
-          <w:rFonts w:eastAsia="Calibri"/>
-          <w:sz w:val="22"/>
-          <w:szCs w:val="22"/>
-        </w:rPr>
-        <w:t xml:space="preserve">Block F, Kessely </w:t>
-      </w:r>
-      <w:r>
-        <w:rPr>
-          <w:rFonts w:eastAsia="Calibri"/>
-          <w:sz w:val="22"/>
-          <w:szCs w:val="22"/>
-        </w:rPr>
-        <w:t>Boulevard,</w:t>
-      </w:r>
-      <w:r>
-        <w:rPr>
-          <w:rFonts w:eastAsia="Calibri"/>
-          <w:sz w:val="22"/>
-          <w:szCs w:val="22"/>
-        </w:rPr>
-        <w:t xml:space="preserve"> Japan Free Way, </w:t>
-      </w:r>
-      <w:r>
-        <w:rPr>
-          <w:rFonts w:eastAsia="Calibri"/>
-          <w:sz w:val="22"/>
-          <w:szCs w:val="22"/>
-        </w:rPr>
-        <w:t>Gardnerville Township, Monrovia, Liberia</w:t>
-      </w:r>
-    </w:p>
-    <w:p>
-      <w:pPr>
-        <w:rPr>
-          <w:rFonts w:eastAsia="Calibri"/>
-          <w:sz w:val="22"/>
-          <w:szCs w:val="22"/>
-        </w:rPr>
-      </w:pPr>
-      <w:r>
-        <w:rPr>
-          <w:rFonts w:eastAsia="Calibri"/>
-          <w:b/>
-          <w:bCs/>
-          <w:sz w:val="22"/>
-          <w:szCs w:val="22"/>
-        </w:rPr>
-        <w:t xml:space="preserve">Phone:     </w:t>
-      </w:r>
-      <w:r>
-        <w:rPr>
-          <w:rFonts w:eastAsia="Calibri"/>
-          <w:sz w:val="22"/>
-          <w:szCs w:val="22"/>
-        </w:rPr>
-        <w:t>+</w:t>
-      </w:r>
-      <w:r>
-        <w:rPr>
-          <w:rFonts w:eastAsia="Calibri"/>
-          <w:sz w:val="22"/>
-          <w:szCs w:val="22"/>
-        </w:rPr>
-        <w:t xml:space="preserve"> (</w:t>
-      </w:r>
-      <w:r>
-        <w:rPr>
-          <w:rFonts w:eastAsia="Calibri"/>
-          <w:sz w:val="22"/>
-          <w:szCs w:val="22"/>
-        </w:rPr>
-        <w:t>231</w:t>
-      </w:r>
-      <w:r>
-        <w:rPr>
-          <w:rFonts w:eastAsia="Calibri"/>
-          <w:sz w:val="22"/>
-          <w:szCs w:val="22"/>
-        </w:rPr>
-        <w:t>)</w:t>
-      </w:r>
-      <w:r>
-        <w:rPr>
-          <w:rFonts w:eastAsia="Calibri"/>
-          <w:sz w:val="22"/>
-          <w:szCs w:val="22"/>
-        </w:rPr>
-        <w:t xml:space="preserve"> 779075108</w:t>
-      </w:r>
-    </w:p>
-    <w:p>
-      <w:r>
-        <w:rPr>
-          <w:rFonts w:eastAsia="Calibri"/>
-          <w:sz w:val="22"/>
-          <w:szCs w:val="22"/>
-        </w:rPr>
-        <w:t xml:space="preserve">Email: </w:t>
-      </w:r>
-      <w:hyperlink r:id="rId5" w:history="1">
-        <w:r>
-          <w:rPr>
-            <w:rStyle w:val="Hyperlink"/>
-            <w:rFonts w:eastAsia="Calibri"/>
-            <w:sz w:val="22"/>
-            <w:szCs w:val="22"/>
-          </w:rPr>
-          <w:t>mailto:nimelyacts765@gmail.com</w:t>
-        </w:r>
-      </w:hyperlink>
-    </w:p>
     <w:p>
       <w:pPr>
         <w:pBdr>

</xml_diff>